<commit_message>
proses isi-formulir dan benerin footer
</commit_message>
<xml_diff>
--- a/public/templates/Form Daftar Paten (2025).docx
+++ b/public/templates/Form Daftar Paten (2025).docx
@@ -63,23 +63,13 @@
                 <w:szCs w:val="21"/>
               </w:rPr>
             </w:pPr>
-            <w:proofErr w:type="gramStart"/>
             <w:r>
               <w:rPr>
                 <w:b/>
                 <w:sz w:val="21"/>
                 <w:szCs w:val="21"/>
               </w:rPr>
-              <w:t>KEMENTERIAN  HUKUM</w:t>
-            </w:r>
-            <w:proofErr w:type="gramEnd"/>
-            <w:r>
-              <w:rPr>
-                <w:b/>
-                <w:sz w:val="21"/>
-                <w:szCs w:val="21"/>
-              </w:rPr>
-              <w:t xml:space="preserve"> REPUBLIK INDONESIA</w:t>
+              <w:t>KEMENTERIAN  HUKUM REPUBLIK INDONESIA</w:t>
             </w:r>
           </w:p>
           <w:p>
@@ -238,7 +228,6 @@
                               <w:t xml:space="preserve"> </w:t>
                             </w:r>
                             <w:proofErr w:type="spellStart"/>
-                            <w:proofErr w:type="gramStart"/>
                             <w:r>
                               <w:rPr>
                                 <w:rFonts w:eastAsia="Arial"/>
@@ -254,7 +243,6 @@
                               </w:rPr>
                               <w:t xml:space="preserve">  :</w:t>
                             </w:r>
-                            <w:proofErr w:type="gramEnd"/>
                           </w:p>
                           <w:p>
                             <w:pPr>
@@ -278,7 +266,6 @@
                               <w:t xml:space="preserve"> </w:t>
                             </w:r>
                             <w:proofErr w:type="spellStart"/>
-                            <w:proofErr w:type="gramStart"/>
                             <w:r>
                               <w:rPr>
                                 <w:rFonts w:eastAsia="Arial"/>
@@ -294,7 +281,6 @@
                               </w:rPr>
                               <w:t xml:space="preserve"> :</w:t>
                             </w:r>
-                            <w:proofErr w:type="gramEnd"/>
                           </w:p>
                           <w:p>
                             <w:pPr>
@@ -381,7 +367,6 @@
                         <w:t xml:space="preserve"> </w:t>
                       </w:r>
                       <w:proofErr w:type="spellStart"/>
-                      <w:proofErr w:type="gramStart"/>
                       <w:r>
                         <w:rPr>
                           <w:rFonts w:eastAsia="Arial"/>
@@ -397,7 +382,6 @@
                         </w:rPr>
                         <w:t xml:space="preserve">  :</w:t>
                       </w:r>
-                      <w:proofErr w:type="gramEnd"/>
                     </w:p>
                     <w:p>
                       <w:pPr>
@@ -421,7 +405,6 @@
                         <w:t xml:space="preserve"> </w:t>
                       </w:r>
                       <w:proofErr w:type="spellStart"/>
-                      <w:proofErr w:type="gramStart"/>
                       <w:r>
                         <w:rPr>
                           <w:rFonts w:eastAsia="Arial"/>
@@ -437,7 +420,6 @@
                         </w:rPr>
                         <w:t xml:space="preserve"> :</w:t>
                       </w:r>
-                      <w:proofErr w:type="gramEnd"/>
                     </w:p>
                     <w:p>
                       <w:pPr>
@@ -926,19 +908,24 @@
               <w:t xml:space="preserve"> </w:t>
             </w:r>
             <w:r>
-              <w:rPr>
-                <w:strike/>
-              </w:rPr>
-              <w:t>paten</w:t>
-            </w:r>
-            <w:r>
-              <w:t xml:space="preserve">/paten </w:t>
-            </w:r>
-            <w:proofErr w:type="spellStart"/>
-            <w:r>
-              <w:t>sederhana</w:t>
-            </w:r>
-            <w:proofErr w:type="spellEnd"/>
+              <w:t>${</w:t>
+            </w:r>
+            <w:proofErr w:type="spellStart"/>
+            <w:r>
+              <w:t>paten_dicoret</w:t>
+            </w:r>
+            <w:proofErr w:type="spellEnd"/>
+            <w:r>
+              <w:t>}/${</w:t>
+            </w:r>
+            <w:proofErr w:type="spellStart"/>
+            <w:r>
+              <w:t>paten_sederhana_dicoret</w:t>
+            </w:r>
+            <w:proofErr w:type="spellEnd"/>
+            <w:r>
+              <w:t xml:space="preserve">} </w:t>
+            </w:r>
           </w:p>
         </w:tc>
         <w:tc>
@@ -999,6 +986,9 @@
             <w:pPr>
               <w:spacing w:after="120"/>
               <w:ind w:left="0" w:hanging="2"/>
+              <w:rPr>
+                <w:lang w:val="en-ID"/>
+              </w:rPr>
             </w:pPr>
             <w:r>
               <w:t xml:space="preserve">Internasional/PCT </w:t>
@@ -1017,13 +1007,28 @@
             </w:r>
             <w:proofErr w:type="spellEnd"/>
             <w:r>
+              <w:t xml:space="preserve">   :</w:t>
+            </w:r>
+            <w:r>
               <w:t xml:space="preserve"> </w:t>
             </w:r>
-            <w:proofErr w:type="gramStart"/>
-            <w:r>
-              <w:t xml:space="preserve">  :</w:t>
-            </w:r>
-            <w:proofErr w:type="gramEnd"/>
+            <w:r>
+              <w:t>${</w:t>
+            </w:r>
+            <w:proofErr w:type="spellStart"/>
+            <w:r>
+              <w:rPr>
+                <w:lang w:val="en-ID"/>
+              </w:rPr>
+              <w:t>nomor_permohonan</w:t>
+            </w:r>
+            <w:proofErr w:type="spellEnd"/>
+            <w:r>
+              <w:rPr>
+                <w:lang w:val="en-ID"/>
+              </w:rPr>
+              <w:t>}</w:t>
+            </w:r>
           </w:p>
         </w:tc>
         <w:tc>
@@ -1063,37 +1068,41 @@
               <w:ind w:left="0" w:hanging="2"/>
             </w:pPr>
             <w:r>
-              <w:rPr>
-                <w:strike/>
-              </w:rPr>
               <w:t xml:space="preserve"> </w:t>
             </w:r>
-            <w:proofErr w:type="spellStart"/>
-            <w:r>
-              <w:rPr>
-                <w:strike/>
-              </w:rPr>
+            <w:r>
+              <w:t>${</w:t>
+            </w:r>
+            <w:proofErr w:type="spellStart"/>
+            <w:r>
               <w:t>melalui</w:t>
             </w:r>
             <w:proofErr w:type="spellEnd"/>
             <w:r>
+              <w:t>}</w:t>
+            </w:r>
+            <w:r>
               <w:t>/</w:t>
             </w:r>
+            <w:r>
+              <w:t>${</w:t>
+            </w:r>
             <w:proofErr w:type="spellStart"/>
             <w:r>
               <w:t>tidak</w:t>
             </w:r>
-            <w:proofErr w:type="spellEnd"/>
-            <w:r>
-              <w:t xml:space="preserve"> </w:t>
-            </w:r>
-            <w:proofErr w:type="spellStart"/>
+            <w:r>
+              <w:t>_</w:t>
+            </w:r>
             <w:r>
               <w:t>melalui</w:t>
             </w:r>
             <w:proofErr w:type="spellEnd"/>
             <w:r>
-              <w:t xml:space="preserve"> *) </w:t>
+              <w:t>}</w:t>
+            </w:r>
+            <w:r>
+              <w:t xml:space="preserve">*) </w:t>
             </w:r>
             <w:proofErr w:type="spellStart"/>
             <w:r>
@@ -1110,6 +1119,9 @@
                 <w:tab w:val="left" w:pos="3312"/>
               </w:tabs>
               <w:ind w:leftChars="319" w:left="768" w:hanging="2"/>
+              <w:rPr>
+                <w:lang w:val="en-ID"/>
+              </w:rPr>
             </w:pPr>
             <w:r>
               <w:t xml:space="preserve">Nama Badan Hukum </w:t>
@@ -1121,15 +1133,24 @@
               <w:t>3</w:t>
             </w:r>
             <w:r>
-              <w:t xml:space="preserve">)   </w:t>
-            </w:r>
-            <w:proofErr w:type="gramStart"/>
-            <w:r>
-              <w:t xml:space="preserve">  :</w:t>
-            </w:r>
-            <w:proofErr w:type="gramEnd"/>
-            <w:r>
-              <w:t xml:space="preserve">  -</w:t>
+              <w:t xml:space="preserve">)     :  </w:t>
+            </w:r>
+            <w:r>
+              <w:t>${</w:t>
+            </w:r>
+            <w:proofErr w:type="spellStart"/>
+            <w:r>
+              <w:rPr>
+                <w:lang w:val="en-ID"/>
+              </w:rPr>
+              <w:t>nama_badan_hukum</w:t>
+            </w:r>
+            <w:proofErr w:type="spellEnd"/>
+            <w:r>
+              <w:rPr>
+                <w:lang w:val="en-ID"/>
+              </w:rPr>
+              <w:t>}</w:t>
             </w:r>
           </w:p>
           <w:p>
@@ -1138,6 +1159,9 @@
                 <w:tab w:val="left" w:pos="3312"/>
               </w:tabs>
               <w:ind w:leftChars="319" w:left="768" w:hanging="2"/>
+              <w:rPr>
+                <w:lang w:val="en-ID"/>
+              </w:rPr>
             </w:pPr>
             <w:r>
               <w:t xml:space="preserve">Alamat Badan Hukum </w:t>
@@ -1149,15 +1173,30 @@
               <w:t>2</w:t>
             </w:r>
             <w:r>
-              <w:t xml:space="preserve">) </w:t>
-            </w:r>
-            <w:proofErr w:type="gramStart"/>
-            <w:r>
-              <w:t xml:space="preserve">  :</w:t>
-            </w:r>
-            <w:proofErr w:type="gramEnd"/>
-            <w:r>
-              <w:t xml:space="preserve">  </w:t>
+              <w:t xml:space="preserve">)   :  </w:t>
+            </w:r>
+            <w:r>
+              <w:t>${</w:t>
+            </w:r>
+            <w:proofErr w:type="spellStart"/>
+            <w:r>
+              <w:rPr>
+                <w:lang w:val="en-ID"/>
+              </w:rPr>
+              <w:t>alamat</w:t>
+            </w:r>
+            <w:r>
+              <w:rPr>
+                <w:lang w:val="en-ID"/>
+              </w:rPr>
+              <w:t>_badan_hukum</w:t>
+            </w:r>
+            <w:proofErr w:type="spellEnd"/>
+            <w:r>
+              <w:rPr>
+                <w:lang w:val="en-ID"/>
+              </w:rPr>
+              <w:t>}</w:t>
             </w:r>
           </w:p>
           <w:p>
@@ -1174,6 +1213,9 @@
                 <w:tab w:val="left" w:pos="3312"/>
               </w:tabs>
               <w:ind w:leftChars="319" w:left="768" w:hanging="2"/>
+              <w:rPr>
+                <w:lang w:val="en-ID"/>
+              </w:rPr>
             </w:pPr>
             <w:r>
               <w:t xml:space="preserve">Nama </w:t>
@@ -1184,15 +1226,24 @@
             </w:r>
             <w:proofErr w:type="spellEnd"/>
             <w:r>
-              <w:t xml:space="preserve"> Paten   </w:t>
-            </w:r>
-            <w:proofErr w:type="gramStart"/>
-            <w:r>
-              <w:t xml:space="preserve">  :</w:t>
-            </w:r>
-            <w:proofErr w:type="gramEnd"/>
-            <w:r>
-              <w:t xml:space="preserve">   -</w:t>
+              <w:t xml:space="preserve"> Paten     :   </w:t>
+            </w:r>
+            <w:r>
+              <w:t>${</w:t>
+            </w:r>
+            <w:proofErr w:type="spellStart"/>
+            <w:r>
+              <w:rPr>
+                <w:lang w:val="en-ID"/>
+              </w:rPr>
+              <w:t>nama_konsultan_paten</w:t>
+            </w:r>
+            <w:proofErr w:type="spellEnd"/>
+            <w:r>
+              <w:rPr>
+                <w:lang w:val="en-ID"/>
+              </w:rPr>
+              <w:t>}</w:t>
             </w:r>
           </w:p>
           <w:p>
@@ -1201,6 +1252,9 @@
                 <w:tab w:val="left" w:pos="3312"/>
               </w:tabs>
               <w:ind w:leftChars="319" w:left="768" w:hanging="2"/>
+              <w:rPr>
+                <w:lang w:val="en-ID"/>
+              </w:rPr>
             </w:pPr>
             <w:r>
               <w:t xml:space="preserve">Alamat </w:t>
@@ -1212,13 +1266,34 @@
               <w:t>2</w:t>
             </w:r>
             <w:r>
-              <w:t xml:space="preserve">)                         </w:t>
-            </w:r>
-            <w:proofErr w:type="gramStart"/>
-            <w:r>
-              <w:t xml:space="preserve">  :</w:t>
-            </w:r>
-            <w:proofErr w:type="gramEnd"/>
+              <w:t>)                           :</w:t>
+            </w:r>
+            <w:r>
+              <w:t xml:space="preserve"> </w:t>
+            </w:r>
+            <w:r>
+              <w:t>${</w:t>
+            </w:r>
+            <w:proofErr w:type="spellStart"/>
+            <w:r>
+              <w:rPr>
+                <w:lang w:val="en-ID"/>
+              </w:rPr>
+              <w:t>alamat</w:t>
+            </w:r>
+            <w:r>
+              <w:rPr>
+                <w:lang w:val="en-ID"/>
+              </w:rPr>
+              <w:t>_konsultan_paten</w:t>
+            </w:r>
+            <w:proofErr w:type="spellEnd"/>
+            <w:r>
+              <w:rPr>
+                <w:lang w:val="en-ID"/>
+              </w:rPr>
+              <w:t>}</w:t>
+            </w:r>
           </w:p>
           <w:p>
             <w:pPr>
@@ -1234,6 +1309,9 @@
                 <w:tab w:val="left" w:pos="3312"/>
               </w:tabs>
               <w:ind w:leftChars="319" w:left="768" w:hanging="2"/>
+              <w:rPr>
+                <w:lang w:val="en-ID"/>
+              </w:rPr>
             </w:pPr>
             <w:proofErr w:type="spellStart"/>
             <w:r>
@@ -1249,15 +1327,24 @@
             </w:r>
             <w:proofErr w:type="spellEnd"/>
             <w:r>
-              <w:t xml:space="preserve"> Paten </w:t>
-            </w:r>
-            <w:proofErr w:type="gramStart"/>
-            <w:r>
-              <w:t xml:space="preserve">  :</w:t>
-            </w:r>
-            <w:proofErr w:type="gramEnd"/>
-            <w:r>
-              <w:t xml:space="preserve">   -</w:t>
+              <w:t xml:space="preserve"> Paten   :   </w:t>
+            </w:r>
+            <w:r>
+              <w:t>${</w:t>
+            </w:r>
+            <w:proofErr w:type="spellStart"/>
+            <w:r>
+              <w:rPr>
+                <w:lang w:val="en-ID"/>
+              </w:rPr>
+              <w:t>nomor_konsultan_paten</w:t>
+            </w:r>
+            <w:proofErr w:type="spellEnd"/>
+            <w:r>
+              <w:rPr>
+                <w:lang w:val="en-ID"/>
+              </w:rPr>
+              <w:t>}</w:t>
             </w:r>
           </w:p>
           <w:p>
@@ -1266,6 +1353,9 @@
                 <w:tab w:val="left" w:pos="3312"/>
               </w:tabs>
               <w:ind w:leftChars="319" w:left="768" w:hanging="2"/>
+              <w:rPr>
+                <w:lang w:val="en-ID"/>
+              </w:rPr>
             </w:pPr>
             <w:proofErr w:type="spellStart"/>
             <w:r>
@@ -1273,15 +1363,24 @@
             </w:r>
             <w:proofErr w:type="spellEnd"/>
             <w:r>
-              <w:t xml:space="preserve"> / fax                   </w:t>
-            </w:r>
-            <w:proofErr w:type="gramStart"/>
-            <w:r>
-              <w:t xml:space="preserve">  :</w:t>
-            </w:r>
-            <w:proofErr w:type="gramEnd"/>
-            <w:r>
-              <w:t xml:space="preserve">  </w:t>
+              <w:t xml:space="preserve"> / fax                     :  </w:t>
+            </w:r>
+            <w:r>
+              <w:t>${</w:t>
+            </w:r>
+            <w:proofErr w:type="spellStart"/>
+            <w:r>
+              <w:rPr>
+                <w:lang w:val="en-ID"/>
+              </w:rPr>
+              <w:t>telepon_fax</w:t>
+            </w:r>
+            <w:proofErr w:type="spellEnd"/>
+            <w:r>
+              <w:rPr>
+                <w:lang w:val="en-ID"/>
+              </w:rPr>
+              <w:t>}</w:t>
             </w:r>
           </w:p>
           <w:p>
@@ -1330,6 +1429,10 @@
           <w:p>
             <w:pPr>
               <w:ind w:left="0" w:hanging="2"/>
+              <w:rPr>
+                <w:color w:val="FF0000"/>
+                <w:lang w:val="en-ID"/>
+              </w:rPr>
             </w:pPr>
             <w:r>
               <w:t xml:space="preserve">(54)  </w:t>
@@ -1356,21 +1459,24 @@
             </w:r>
             <w:proofErr w:type="spellEnd"/>
             <w:r>
-              <w:t xml:space="preserve">           </w:t>
-            </w:r>
-            <w:proofErr w:type="gramStart"/>
-            <w:r>
-              <w:t xml:space="preserve">  :</w:t>
-            </w:r>
-            <w:proofErr w:type="gramEnd"/>
-            <w:r>
-              <w:t xml:space="preserve"> </w:t>
-            </w:r>
-            <w:r>
-              <w:rPr>
-                <w:color w:val="FF0000"/>
-              </w:rPr>
-              <w:t>............JUDUL DRAFT PATEN..........</w:t>
+              <w:t xml:space="preserve">             : </w:t>
+            </w:r>
+            <w:r>
+              <w:t>${</w:t>
+            </w:r>
+            <w:proofErr w:type="spellStart"/>
+            <w:r>
+              <w:rPr>
+                <w:lang w:val="en-ID"/>
+              </w:rPr>
+              <w:t>judul_invensi</w:t>
+            </w:r>
+            <w:proofErr w:type="spellEnd"/>
+            <w:r>
+              <w:rPr>
+                <w:lang w:val="en-ID"/>
+              </w:rPr>
+              <w:t>}</w:t>
             </w:r>
           </w:p>
           <w:p>
@@ -1466,6 +1572,9 @@
           <w:p>
             <w:pPr>
               <w:ind w:left="0" w:hanging="2"/>
+              <w:rPr>
+                <w:lang w:val="en-ID"/>
+              </w:rPr>
             </w:pPr>
             <w:proofErr w:type="spellStart"/>
             <w:r>
@@ -1489,13 +1598,31 @@
             </w:r>
             <w:proofErr w:type="spellEnd"/>
             <w:r>
-              <w:t xml:space="preserve">   </w:t>
-            </w:r>
-            <w:proofErr w:type="gramStart"/>
-            <w:r>
-              <w:t xml:space="preserve">  :</w:t>
-            </w:r>
-            <w:proofErr w:type="gramEnd"/>
+              <w:t xml:space="preserve">     :</w:t>
+            </w:r>
+            <w:r>
+              <w:rPr>
+                <w:color w:val="C00000"/>
+              </w:rPr>
+              <w:t xml:space="preserve"> </w:t>
+            </w:r>
+            <w:r>
+              <w:t>${</w:t>
+            </w:r>
+            <w:proofErr w:type="spellStart"/>
+            <w:r>
+              <w:rPr>
+                <w:lang w:val="en-ID"/>
+              </w:rPr>
+              <w:t>pecahan_paten</w:t>
+            </w:r>
+            <w:proofErr w:type="spellEnd"/>
+            <w:r>
+              <w:rPr>
+                <w:lang w:val="en-ID"/>
+              </w:rPr>
+              <w:t>}</w:t>
+            </w:r>
           </w:p>
           <w:p>
             <w:pPr>
@@ -1532,23 +1659,7 @@
     </w:tbl>
     <w:p>
       <w:pPr>
-        <w:ind w:left="0" w:hanging="2"/>
-        <w:rPr>
-          <w:u w:val="single"/>
-        </w:rPr>
-      </w:pPr>
-    </w:p>
-    <w:p>
-      <w:pPr>
-        <w:ind w:left="0" w:hanging="2"/>
-        <w:rPr>
-          <w:u w:val="single"/>
-        </w:rPr>
-      </w:pPr>
-    </w:p>
-    <w:p>
-      <w:pPr>
-        <w:ind w:left="0" w:hanging="2"/>
+        <w:ind w:leftChars="0" w:left="0" w:firstLineChars="0" w:firstLine="0"/>
         <w:rPr>
           <w:u w:val="single"/>
         </w:rPr>
@@ -1559,14 +1670,6 @@
         <w:tblStyle w:val="a1"/>
         <w:tblW w:w="10080" w:type="dxa"/>
         <w:tblInd w:w="-180" w:type="dxa"/>
-        <w:tblBorders>
-          <w:top w:val="single" w:sz="4" w:space="0" w:color="000000"/>
-          <w:left w:val="single" w:sz="4" w:space="0" w:color="000000"/>
-          <w:bottom w:val="single" w:sz="4" w:space="0" w:color="000000"/>
-          <w:right w:val="single" w:sz="4" w:space="0" w:color="000000"/>
-          <w:insideH w:val="single" w:sz="4" w:space="0" w:color="000000"/>
-          <w:insideV w:val="single" w:sz="4" w:space="0" w:color="000000"/>
-        </w:tblBorders>
         <w:tblLayout w:type="fixed"/>
         <w:tblLook w:val="0000" w:firstRow="0" w:lastRow="0" w:firstColumn="0" w:lastColumn="0" w:noHBand="0" w:noVBand="0"/>
       </w:tblPr>
@@ -1578,6 +1681,12 @@
         <w:tc>
           <w:tcPr>
             <w:tcW w:w="8100" w:type="dxa"/>
+            <w:tcBorders>
+              <w:top w:val="single" w:sz="4" w:space="0" w:color="auto"/>
+              <w:left w:val="single" w:sz="4" w:space="0" w:color="auto"/>
+              <w:bottom w:val="single" w:sz="4" w:space="0" w:color="auto"/>
+              <w:right w:val="single" w:sz="4" w:space="0" w:color="auto"/>
+            </w:tcBorders>
           </w:tcPr>
           <w:p>
             <w:pPr>
@@ -1597,13 +1706,8 @@
             </w:r>
             <w:proofErr w:type="spellEnd"/>
             <w:r>
-              <w:t xml:space="preserve"> para </w:t>
-            </w:r>
-            <w:proofErr w:type="gramStart"/>
-            <w:r>
-              <w:t>inventor :</w:t>
-            </w:r>
-            <w:proofErr w:type="gramEnd"/>
+              <w:t xml:space="preserve"> para inventor :</w:t>
+            </w:r>
           </w:p>
           <w:p>
             <w:pPr>
@@ -1623,82 +1727,25 @@
               <w:ind w:left="0" w:hanging="2"/>
               <w:rPr>
                 <w:color w:val="FF0000"/>
-              </w:rPr>
-            </w:pPr>
-            <w:r>
-              <w:rPr>
-                <w:color w:val="FF0000"/>
-              </w:rPr>
-              <w:t xml:space="preserve">.........................                           </w:t>
-            </w:r>
-            <w:proofErr w:type="spellStart"/>
-            <w:r>
-              <w:rPr>
-                <w:color w:val="FF0000"/>
-              </w:rPr>
-              <w:t>warga</w:t>
-            </w:r>
-            <w:proofErr w:type="spellEnd"/>
-            <w:r>
-              <w:rPr>
-                <w:color w:val="FF0000"/>
-              </w:rPr>
-              <w:t xml:space="preserve"> negara INDONESIA                                      </w:t>
-            </w:r>
-          </w:p>
-          <w:p>
-            <w:pPr>
-              <w:spacing w:line="360" w:lineRule="auto"/>
-              <w:ind w:left="0" w:hanging="2"/>
-              <w:rPr>
-                <w:color w:val="FF0000"/>
-              </w:rPr>
-            </w:pPr>
-            <w:r>
-              <w:rPr>
-                <w:color w:val="FF0000"/>
-              </w:rPr>
-              <w:t xml:space="preserve">.........................                           </w:t>
-            </w:r>
-            <w:proofErr w:type="spellStart"/>
-            <w:r>
-              <w:rPr>
-                <w:color w:val="FF0000"/>
-              </w:rPr>
-              <w:t>warga</w:t>
-            </w:r>
-            <w:proofErr w:type="spellEnd"/>
-            <w:r>
-              <w:rPr>
-                <w:color w:val="FF0000"/>
-              </w:rPr>
-              <w:t xml:space="preserve"> negara INDONESIA                                      </w:t>
-            </w:r>
-          </w:p>
-          <w:p>
-            <w:pPr>
-              <w:spacing w:line="360" w:lineRule="auto"/>
-              <w:ind w:left="0" w:hanging="2"/>
-            </w:pPr>
-            <w:r>
-              <w:rPr>
-                <w:color w:val="FF0000"/>
-              </w:rPr>
-              <w:t xml:space="preserve">.........................                           </w:t>
-            </w:r>
-            <w:proofErr w:type="spellStart"/>
-            <w:r>
-              <w:rPr>
-                <w:color w:val="FF0000"/>
-              </w:rPr>
-              <w:t>warga</w:t>
-            </w:r>
-            <w:proofErr w:type="spellEnd"/>
-            <w:r>
-              <w:rPr>
-                <w:color w:val="FF0000"/>
-              </w:rPr>
-              <w:t xml:space="preserve"> negara INDONESIA</w:t>
+                <w:lang w:val="en-ID"/>
+              </w:rPr>
+            </w:pPr>
+            <w:r>
+              <w:t>${</w:t>
+            </w:r>
+            <w:proofErr w:type="spellStart"/>
+            <w:r>
+              <w:rPr>
+                <w:lang w:val="en-ID"/>
+              </w:rPr>
+              <w:t>inventor_input</w:t>
+            </w:r>
+            <w:proofErr w:type="spellEnd"/>
+            <w:r>
+              <w:rPr>
+                <w:lang w:val="en-ID"/>
+              </w:rPr>
+              <w:t>}</w:t>
             </w:r>
             <w:r>
               <w:t xml:space="preserve">                                      </w:t>
@@ -1708,6 +1755,12 @@
         <w:tc>
           <w:tcPr>
             <w:tcW w:w="1980" w:type="dxa"/>
+            <w:tcBorders>
+              <w:top w:val="single" w:sz="4" w:space="0" w:color="auto"/>
+              <w:left w:val="single" w:sz="4" w:space="0" w:color="auto"/>
+              <w:bottom w:val="single" w:sz="4" w:space="0" w:color="auto"/>
+              <w:right w:val="single" w:sz="4" w:space="0" w:color="auto"/>
+            </w:tcBorders>
           </w:tcPr>
           <w:p>
             <w:pPr>
@@ -1773,6 +1826,12 @@
         <w:tc>
           <w:tcPr>
             <w:tcW w:w="8100" w:type="dxa"/>
+            <w:tcBorders>
+              <w:top w:val="single" w:sz="4" w:space="0" w:color="auto"/>
+              <w:left w:val="single" w:sz="4" w:space="0" w:color="auto"/>
+              <w:bottom w:val="single" w:sz="4" w:space="0" w:color="auto"/>
+              <w:right w:val="single" w:sz="4" w:space="0" w:color="auto"/>
+            </w:tcBorders>
           </w:tcPr>
           <w:p>
             <w:pPr>
@@ -1811,28 +1870,38 @@
             <w:r>
               <w:t xml:space="preserve"> </w:t>
             </w:r>
+            <w:r>
+              <w:t>${</w:t>
+            </w:r>
             <w:proofErr w:type="spellStart"/>
             <w:r>
               <w:t>dengan</w:t>
             </w:r>
             <w:proofErr w:type="spellEnd"/>
             <w:r>
+              <w:t>}</w:t>
+            </w:r>
+            <w:r>
               <w:t>/</w:t>
             </w:r>
+            <w:r>
+              <w:t>${</w:t>
+            </w:r>
             <w:proofErr w:type="spellStart"/>
             <w:r>
               <w:t>tidak</w:t>
             </w:r>
-            <w:proofErr w:type="spellEnd"/>
-            <w:r>
-              <w:t xml:space="preserve"> </w:t>
-            </w:r>
-            <w:proofErr w:type="spellStart"/>
+            <w:r>
+              <w:t>_</w:t>
+            </w:r>
             <w:r>
               <w:t>dengan</w:t>
             </w:r>
             <w:proofErr w:type="spellEnd"/>
             <w:r>
+              <w:t>}</w:t>
+            </w:r>
+            <w:r>
               <w:t xml:space="preserve"> *)</w:t>
             </w:r>
           </w:p>
@@ -1844,7 +1913,6 @@
               <w:t xml:space="preserve">Hak </w:t>
             </w:r>
             <w:proofErr w:type="spellStart"/>
-            <w:proofErr w:type="gramStart"/>
             <w:r>
               <w:t>prioritas</w:t>
             </w:r>
@@ -1860,92 +1928,303 @@
               </w:rPr>
               <w:t>4</w:t>
             </w:r>
-            <w:proofErr w:type="gramEnd"/>
             <w:r>
               <w:t>)</w:t>
             </w:r>
           </w:p>
-          <w:p>
-            <w:pPr>
-              <w:ind w:left="0" w:hanging="2"/>
-            </w:pPr>
-          </w:p>
-          <w:p>
-            <w:pPr>
-              <w:ind w:left="0" w:hanging="2"/>
-            </w:pPr>
-            <w:proofErr w:type="gramStart"/>
-            <w:r>
-              <w:t>Negara :</w:t>
-            </w:r>
-            <w:proofErr w:type="gramEnd"/>
-            <w:r>
-              <w:t xml:space="preserve">        Tgl. </w:t>
-            </w:r>
-            <w:proofErr w:type="spellStart"/>
-            <w:r>
-              <w:t>Penerimaan</w:t>
-            </w:r>
-            <w:proofErr w:type="spellEnd"/>
-            <w:r>
-              <w:t xml:space="preserve"> </w:t>
-            </w:r>
-            <w:proofErr w:type="spellStart"/>
-            <w:r>
-              <w:t>permohonan</w:t>
-            </w:r>
-            <w:proofErr w:type="spellEnd"/>
-            <w:r>
-              <w:t xml:space="preserve">        </w:t>
-            </w:r>
-            <w:proofErr w:type="spellStart"/>
-            <w:r>
-              <w:t>Nomor</w:t>
-            </w:r>
-            <w:proofErr w:type="spellEnd"/>
-            <w:r>
-              <w:t xml:space="preserve"> </w:t>
-            </w:r>
-            <w:proofErr w:type="spellStart"/>
-            <w:r>
-              <w:t>prioritas</w:t>
-            </w:r>
-            <w:proofErr w:type="spellEnd"/>
-          </w:p>
-          <w:p>
-            <w:pPr>
-              <w:ind w:left="0" w:hanging="2"/>
-            </w:pPr>
-            <w:r>
-              <w:t>..................     ...............................................     .................................</w:t>
-            </w:r>
-          </w:p>
-          <w:p>
-            <w:pPr>
-              <w:ind w:left="0" w:hanging="2"/>
-            </w:pPr>
-            <w:r>
-              <w:t>..................     ...............................................     .................................</w:t>
-            </w:r>
-          </w:p>
-          <w:p>
-            <w:pPr>
-              <w:ind w:left="0" w:hanging="2"/>
-            </w:pPr>
-            <w:r>
-              <w:t>..................     ...............................................     .................................</w:t>
-            </w:r>
-          </w:p>
-          <w:p>
-            <w:pPr>
-              <w:spacing w:line="360" w:lineRule="auto"/>
-              <w:ind w:left="0" w:hanging="2"/>
+          <w:tbl>
+            <w:tblPr>
+              <w:tblStyle w:val="TableGrid"/>
+              <w:tblW w:w="0" w:type="auto"/>
+              <w:tblBorders>
+                <w:top w:val="single" w:sz="4" w:space="0" w:color="FFFFFF" w:themeColor="background1"/>
+                <w:left w:val="single" w:sz="4" w:space="0" w:color="FFFFFF" w:themeColor="background1"/>
+                <w:bottom w:val="single" w:sz="4" w:space="0" w:color="FFFFFF" w:themeColor="background1"/>
+                <w:right w:val="single" w:sz="4" w:space="0" w:color="FFFFFF" w:themeColor="background1"/>
+                <w:insideH w:val="single" w:sz="4" w:space="0" w:color="FFFFFF" w:themeColor="background1"/>
+                <w:insideV w:val="single" w:sz="4" w:space="0" w:color="FFFFFF" w:themeColor="background1"/>
+              </w:tblBorders>
+              <w:tblLook w:val="04A0" w:firstRow="1" w:lastRow="0" w:firstColumn="1" w:lastColumn="0" w:noHBand="0" w:noVBand="1"/>
+            </w:tblPr>
+            <w:tblGrid>
+              <w:gridCol w:w="1195"/>
+              <w:gridCol w:w="3119"/>
+              <w:gridCol w:w="2126"/>
+            </w:tblGrid>
+            <w:tr>
+              <w:tc>
+                <w:tcPr>
+                  <w:tcW w:w="1195" w:type="dxa"/>
+                </w:tcPr>
+                <w:p>
+                  <w:pPr>
+                    <w:pBdr>
+                      <w:top w:val="single" w:sz="4" w:space="1" w:color="FFFFFF" w:themeColor="background1"/>
+                      <w:left w:val="single" w:sz="4" w:space="4" w:color="FFFFFF" w:themeColor="background1"/>
+                      <w:bottom w:val="single" w:sz="4" w:space="1" w:color="FFFFFF" w:themeColor="background1"/>
+                      <w:right w:val="single" w:sz="4" w:space="4" w:color="FFFFFF" w:themeColor="background1"/>
+                      <w:between w:val="single" w:sz="4" w:space="1" w:color="FFFFFF" w:themeColor="background1"/>
+                      <w:bar w:val="single" w:sz="4" w:color="FFFFFF" w:themeColor="background1"/>
+                    </w:pBdr>
+                    <w:ind w:leftChars="0" w:left="0" w:firstLineChars="0" w:firstLine="0"/>
+                  </w:pPr>
+                  <w:r>
+                    <w:t>Negara:</w:t>
+                  </w:r>
+                </w:p>
+              </w:tc>
+              <w:tc>
+                <w:tcPr>
+                  <w:tcW w:w="3119" w:type="dxa"/>
+                </w:tcPr>
+                <w:p>
+                  <w:pPr>
+                    <w:pBdr>
+                      <w:top w:val="single" w:sz="4" w:space="1" w:color="FFFFFF" w:themeColor="background1"/>
+                      <w:left w:val="single" w:sz="4" w:space="4" w:color="FFFFFF" w:themeColor="background1"/>
+                      <w:bottom w:val="single" w:sz="4" w:space="1" w:color="FFFFFF" w:themeColor="background1"/>
+                      <w:right w:val="single" w:sz="4" w:space="4" w:color="FFFFFF" w:themeColor="background1"/>
+                      <w:between w:val="single" w:sz="4" w:space="1" w:color="FFFFFF" w:themeColor="background1"/>
+                      <w:bar w:val="single" w:sz="4" w:color="FFFFFF" w:themeColor="background1"/>
+                    </w:pBdr>
+                    <w:ind w:leftChars="0" w:left="0" w:firstLineChars="0" w:firstLine="0"/>
+                  </w:pPr>
+                  <w:proofErr w:type="spellStart"/>
+                  <w:r>
+                    <w:t>Tgl</w:t>
+                  </w:r>
+                  <w:proofErr w:type="spellEnd"/>
+                  <w:r>
+                    <w:t xml:space="preserve">. </w:t>
+                  </w:r>
+                  <w:proofErr w:type="spellStart"/>
+                  <w:r>
+                    <w:t>Penerimaan</w:t>
+                  </w:r>
+                  <w:proofErr w:type="spellEnd"/>
+                  <w:r>
+                    <w:t xml:space="preserve"> </w:t>
+                  </w:r>
+                  <w:proofErr w:type="spellStart"/>
+                  <w:r>
+                    <w:t>permohonan</w:t>
+                  </w:r>
+                  <w:proofErr w:type="spellEnd"/>
+                </w:p>
+              </w:tc>
+              <w:tc>
+                <w:tcPr>
+                  <w:tcW w:w="2126" w:type="dxa"/>
+                </w:tcPr>
+                <w:p>
+                  <w:pPr>
+                    <w:pBdr>
+                      <w:top w:val="single" w:sz="4" w:space="1" w:color="FFFFFF" w:themeColor="background1"/>
+                      <w:left w:val="single" w:sz="4" w:space="4" w:color="FFFFFF" w:themeColor="background1"/>
+                      <w:bottom w:val="single" w:sz="4" w:space="1" w:color="FFFFFF" w:themeColor="background1"/>
+                      <w:right w:val="single" w:sz="4" w:space="4" w:color="FFFFFF" w:themeColor="background1"/>
+                      <w:between w:val="single" w:sz="4" w:space="1" w:color="FFFFFF" w:themeColor="background1"/>
+                      <w:bar w:val="single" w:sz="4" w:color="FFFFFF" w:themeColor="background1"/>
+                    </w:pBdr>
+                    <w:ind w:leftChars="0" w:left="0" w:firstLineChars="0" w:firstLine="0"/>
+                  </w:pPr>
+                  <w:proofErr w:type="spellStart"/>
+                  <w:r>
+                    <w:t>Nomor</w:t>
+                  </w:r>
+                  <w:proofErr w:type="spellEnd"/>
+                  <w:r>
+                    <w:t xml:space="preserve"> </w:t>
+                  </w:r>
+                  <w:proofErr w:type="spellStart"/>
+                  <w:r>
+                    <w:t>Prioritas</w:t>
+                  </w:r>
+                  <w:proofErr w:type="spellEnd"/>
+                </w:p>
+              </w:tc>
+            </w:tr>
+            <w:tr>
+              <w:tc>
+                <w:tcPr>
+                  <w:tcW w:w="1195" w:type="dxa"/>
+                </w:tcPr>
+                <w:p>
+                  <w:pPr>
+                    <w:pBdr>
+                      <w:top w:val="single" w:sz="4" w:space="1" w:color="FFFFFF" w:themeColor="background1"/>
+                      <w:left w:val="single" w:sz="4" w:space="4" w:color="FFFFFF" w:themeColor="background1"/>
+                      <w:bottom w:val="single" w:sz="4" w:space="1" w:color="FFFFFF" w:themeColor="background1"/>
+                      <w:right w:val="single" w:sz="4" w:space="4" w:color="FFFFFF" w:themeColor="background1"/>
+                      <w:between w:val="single" w:sz="4" w:space="1" w:color="FFFFFF" w:themeColor="background1"/>
+                      <w:bar w:val="single" w:sz="4" w:color="FFFFFF" w:themeColor="background1"/>
+                    </w:pBdr>
+                    <w:ind w:leftChars="0" w:left="0" w:firstLineChars="0" w:firstLine="0"/>
+                  </w:pPr>
+                  <w:r>
+                    <w:t xml:space="preserve">${negara}      </w:t>
+                  </w:r>
+                </w:p>
+              </w:tc>
+              <w:tc>
+                <w:tcPr>
+                  <w:tcW w:w="3119" w:type="dxa"/>
+                </w:tcPr>
+                <w:p>
+                  <w:pPr>
+                    <w:pBdr>
+                      <w:top w:val="single" w:sz="4" w:space="1" w:color="FFFFFF" w:themeColor="background1"/>
+                      <w:left w:val="single" w:sz="4" w:space="4" w:color="FFFFFF" w:themeColor="background1"/>
+                      <w:bottom w:val="single" w:sz="4" w:space="1" w:color="FFFFFF" w:themeColor="background1"/>
+                      <w:right w:val="single" w:sz="4" w:space="4" w:color="FFFFFF" w:themeColor="background1"/>
+                      <w:between w:val="single" w:sz="4" w:space="1" w:color="FFFFFF" w:themeColor="background1"/>
+                      <w:bar w:val="single" w:sz="4" w:color="FFFFFF" w:themeColor="background1"/>
+                    </w:pBdr>
+                    <w:ind w:leftChars="0" w:left="0" w:firstLineChars="0" w:firstLine="0"/>
+                  </w:pPr>
+                  <w:r>
+                    <w:t>${</w:t>
+                  </w:r>
+                  <w:proofErr w:type="spellStart"/>
+                  <w:r>
+                    <w:t>tgl_penerimaan</w:t>
+                  </w:r>
+                  <w:proofErr w:type="spellEnd"/>
+                  <w:r>
+                    <w:t xml:space="preserve">}                        </w:t>
+                  </w:r>
+                </w:p>
+              </w:tc>
+              <w:tc>
+                <w:tcPr>
+                  <w:tcW w:w="2126" w:type="dxa"/>
+                </w:tcPr>
+                <w:p>
+                  <w:pPr>
+                    <w:pBdr>
+                      <w:top w:val="single" w:sz="4" w:space="1" w:color="FFFFFF" w:themeColor="background1"/>
+                      <w:left w:val="single" w:sz="4" w:space="4" w:color="FFFFFF" w:themeColor="background1"/>
+                      <w:bottom w:val="single" w:sz="4" w:space="1" w:color="FFFFFF" w:themeColor="background1"/>
+                      <w:right w:val="single" w:sz="4" w:space="4" w:color="FFFFFF" w:themeColor="background1"/>
+                      <w:between w:val="single" w:sz="4" w:space="1" w:color="FFFFFF" w:themeColor="background1"/>
+                      <w:bar w:val="single" w:sz="4" w:color="FFFFFF" w:themeColor="background1"/>
+                    </w:pBdr>
+                    <w:tabs>
+                      <w:tab w:val="left" w:pos="4965"/>
+                    </w:tabs>
+                    <w:ind w:leftChars="0" w:left="0" w:firstLineChars="0" w:firstLine="0"/>
+                  </w:pPr>
+                  <w:r>
+                    <w:t>${</w:t>
+                  </w:r>
+                  <w:proofErr w:type="spellStart"/>
+                  <w:r>
+                    <w:t>nomor_prioritas</w:t>
+                  </w:r>
+                  <w:proofErr w:type="spellEnd"/>
+                  <w:r>
+                    <w:t>}</w:t>
+                  </w:r>
+                </w:p>
+                <w:p>
+                  <w:pPr>
+                    <w:pBdr>
+                      <w:top w:val="single" w:sz="4" w:space="1" w:color="FFFFFF" w:themeColor="background1"/>
+                      <w:left w:val="single" w:sz="4" w:space="4" w:color="FFFFFF" w:themeColor="background1"/>
+                      <w:bottom w:val="single" w:sz="4" w:space="1" w:color="FFFFFF" w:themeColor="background1"/>
+                      <w:right w:val="single" w:sz="4" w:space="4" w:color="FFFFFF" w:themeColor="background1"/>
+                      <w:between w:val="single" w:sz="4" w:space="1" w:color="FFFFFF" w:themeColor="background1"/>
+                      <w:bar w:val="single" w:sz="4" w:color="FFFFFF" w:themeColor="background1"/>
+                    </w:pBdr>
+                    <w:ind w:leftChars="0" w:left="0" w:firstLineChars="0" w:firstLine="0"/>
+                  </w:pPr>
+                </w:p>
+              </w:tc>
+            </w:tr>
+            <w:tr>
+              <w:tc>
+                <w:tcPr>
+                  <w:tcW w:w="1195" w:type="dxa"/>
+                </w:tcPr>
+                <w:p>
+                  <w:pPr>
+                    <w:pBdr>
+                      <w:top w:val="single" w:sz="4" w:space="1" w:color="FFFFFF" w:themeColor="background1"/>
+                      <w:left w:val="single" w:sz="4" w:space="4" w:color="FFFFFF" w:themeColor="background1"/>
+                      <w:bottom w:val="single" w:sz="4" w:space="1" w:color="FFFFFF" w:themeColor="background1"/>
+                      <w:right w:val="single" w:sz="4" w:space="4" w:color="FFFFFF" w:themeColor="background1"/>
+                      <w:between w:val="single" w:sz="4" w:space="1" w:color="FFFFFF" w:themeColor="background1"/>
+                      <w:bar w:val="single" w:sz="4" w:color="FFFFFF" w:themeColor="background1"/>
+                    </w:pBdr>
+                    <w:ind w:leftChars="0" w:left="0" w:firstLineChars="0" w:firstLine="0"/>
+                  </w:pPr>
+                </w:p>
+              </w:tc>
+              <w:tc>
+                <w:tcPr>
+                  <w:tcW w:w="3119" w:type="dxa"/>
+                </w:tcPr>
+                <w:p>
+                  <w:pPr>
+                    <w:pBdr>
+                      <w:top w:val="single" w:sz="4" w:space="1" w:color="FFFFFF" w:themeColor="background1"/>
+                      <w:left w:val="single" w:sz="4" w:space="4" w:color="FFFFFF" w:themeColor="background1"/>
+                      <w:bottom w:val="single" w:sz="4" w:space="1" w:color="FFFFFF" w:themeColor="background1"/>
+                      <w:right w:val="single" w:sz="4" w:space="4" w:color="FFFFFF" w:themeColor="background1"/>
+                      <w:between w:val="single" w:sz="4" w:space="1" w:color="FFFFFF" w:themeColor="background1"/>
+                      <w:bar w:val="single" w:sz="4" w:color="FFFFFF" w:themeColor="background1"/>
+                    </w:pBdr>
+                    <w:ind w:leftChars="0" w:left="0" w:firstLineChars="0" w:firstLine="0"/>
+                  </w:pPr>
+                </w:p>
+              </w:tc>
+              <w:tc>
+                <w:tcPr>
+                  <w:tcW w:w="2126" w:type="dxa"/>
+                </w:tcPr>
+                <w:p>
+                  <w:pPr>
+                    <w:pBdr>
+                      <w:top w:val="single" w:sz="4" w:space="1" w:color="FFFFFF" w:themeColor="background1"/>
+                      <w:left w:val="single" w:sz="4" w:space="4" w:color="FFFFFF" w:themeColor="background1"/>
+                      <w:bottom w:val="single" w:sz="4" w:space="1" w:color="FFFFFF" w:themeColor="background1"/>
+                      <w:right w:val="single" w:sz="4" w:space="4" w:color="FFFFFF" w:themeColor="background1"/>
+                      <w:between w:val="single" w:sz="4" w:space="1" w:color="FFFFFF" w:themeColor="background1"/>
+                      <w:bar w:val="single" w:sz="4" w:color="FFFFFF" w:themeColor="background1"/>
+                    </w:pBdr>
+                    <w:ind w:leftChars="0" w:left="0" w:firstLineChars="0" w:firstLine="0"/>
+                  </w:pPr>
+                </w:p>
+              </w:tc>
+            </w:tr>
+          </w:tbl>
+          <w:p>
+            <w:pPr>
+              <w:pBdr>
+                <w:top w:val="single" w:sz="4" w:space="1" w:color="FFFFFF" w:themeColor="background1"/>
+                <w:left w:val="single" w:sz="4" w:space="4" w:color="FFFFFF" w:themeColor="background1"/>
+                <w:bottom w:val="single" w:sz="4" w:space="1" w:color="FFFFFF" w:themeColor="background1"/>
+                <w:right w:val="single" w:sz="4" w:space="4" w:color="FFFFFF" w:themeColor="background1"/>
+                <w:between w:val="single" w:sz="4" w:space="1" w:color="FFFFFF" w:themeColor="background1"/>
+                <w:bar w:val="single" w:sz="4" w:color="FFFFFF" w:themeColor="background1"/>
+              </w:pBdr>
+              <w:ind w:leftChars="0" w:left="0" w:firstLineChars="0" w:firstLine="0"/>
+            </w:pPr>
+          </w:p>
+          <w:p>
+            <w:pPr>
+              <w:ind w:leftChars="0" w:left="0" w:firstLineChars="0" w:firstLine="0"/>
             </w:pPr>
           </w:p>
         </w:tc>
         <w:tc>
           <w:tcPr>
             <w:tcW w:w="1980" w:type="dxa"/>
+            <w:tcBorders>
+              <w:top w:val="single" w:sz="4" w:space="0" w:color="auto"/>
+              <w:left w:val="single" w:sz="4" w:space="0" w:color="auto"/>
+              <w:right w:val="single" w:sz="4" w:space="0" w:color="auto"/>
+            </w:tcBorders>
           </w:tcPr>
           <w:p>
             <w:pPr>
@@ -1974,6 +2253,12 @@
         <w:tc>
           <w:tcPr>
             <w:tcW w:w="8100" w:type="dxa"/>
+            <w:tcBorders>
+              <w:top w:val="single" w:sz="4" w:space="0" w:color="auto"/>
+              <w:left w:val="single" w:sz="4" w:space="0" w:color="auto"/>
+              <w:bottom w:val="single" w:sz="4" w:space="0" w:color="auto"/>
+              <w:right w:val="single" w:sz="4" w:space="0" w:color="auto"/>
+            </w:tcBorders>
           </w:tcPr>
           <w:p>
             <w:pPr>
@@ -2004,7 +2289,6 @@
               <w:t xml:space="preserve"> </w:t>
             </w:r>
             <w:proofErr w:type="spellStart"/>
-            <w:proofErr w:type="gramStart"/>
             <w:r>
               <w:t>lampirkan</w:t>
             </w:r>
@@ -2023,7 +2307,6 @@
             <w:r>
               <w:t>)  :</w:t>
             </w:r>
-            <w:proofErr w:type="gramEnd"/>
           </w:p>
           <w:p>
             <w:pPr>
@@ -2046,7 +2329,6 @@
               <w:t xml:space="preserve">) </w:t>
             </w:r>
             <w:proofErr w:type="spellStart"/>
-            <w:proofErr w:type="gramStart"/>
             <w:r>
               <w:t>rangkap</w:t>
             </w:r>
@@ -2054,27 +2336,35 @@
             <w:r>
               <w:t xml:space="preserve"> :</w:t>
             </w:r>
-            <w:proofErr w:type="gramEnd"/>
-          </w:p>
-          <w:p>
-            <w:pPr>
-              <w:ind w:left="0" w:hanging="2"/>
-            </w:pPr>
-          </w:p>
-          <w:p>
-            <w:pPr>
-              <w:ind w:left="0" w:hanging="2"/>
-            </w:pPr>
-            <w:r>
-              <w:t xml:space="preserve">[   </w:t>
-            </w:r>
-            <w:proofErr w:type="gramStart"/>
-            <w:r>
-              <w:t xml:space="preserve">  ]</w:t>
-            </w:r>
-            <w:proofErr w:type="gramEnd"/>
-            <w:r>
-              <w:t xml:space="preserve">  </w:t>
+          </w:p>
+          <w:p>
+            <w:pPr>
+              <w:ind w:left="0" w:hanging="2"/>
+            </w:pPr>
+          </w:p>
+          <w:p>
+            <w:pPr>
+              <w:ind w:left="0" w:hanging="2"/>
+            </w:pPr>
+            <w:r>
+              <w:t>[</w:t>
+            </w:r>
+            <w:r>
+              <w:t>${</w:t>
+            </w:r>
+            <w:proofErr w:type="spellStart"/>
+            <w:r>
+              <w:t>lamp_surat_kuasa</w:t>
+            </w:r>
+            <w:proofErr w:type="spellEnd"/>
+            <w:r>
+              <w:t>}</w:t>
+            </w:r>
+            <w:r>
+              <w:t>]</w:t>
+            </w:r>
+            <w:r>
+              <w:t xml:space="preserve"> </w:t>
             </w:r>
             <w:proofErr w:type="spellStart"/>
             <w:r>
@@ -2095,15 +2385,7 @@
               <w:ind w:left="0" w:hanging="2"/>
             </w:pPr>
             <w:r>
-              <w:t xml:space="preserve">[ </w:t>
-            </w:r>
-            <w:proofErr w:type="gramStart"/>
-            <w:r>
-              <w:t>X ]</w:t>
-            </w:r>
-            <w:proofErr w:type="gramEnd"/>
-            <w:r>
-              <w:t xml:space="preserve">  </w:t>
+              <w:t xml:space="preserve">[ X ]  </w:t>
             </w:r>
             <w:proofErr w:type="spellStart"/>
             <w:r>
@@ -2148,15 +2430,7 @@
               <w:ind w:left="0" w:hanging="2"/>
             </w:pPr>
             <w:r>
-              <w:t xml:space="preserve">[ </w:t>
-            </w:r>
-            <w:proofErr w:type="gramStart"/>
-            <w:r>
-              <w:t>X ]</w:t>
-            </w:r>
-            <w:proofErr w:type="gramEnd"/>
-            <w:r>
-              <w:t xml:space="preserve">  </w:t>
+              <w:t xml:space="preserve">[ X ]  </w:t>
             </w:r>
             <w:proofErr w:type="spellStart"/>
             <w:r>
@@ -2201,15 +2475,21 @@
               <w:ind w:left="0" w:hanging="2"/>
             </w:pPr>
             <w:r>
-              <w:t xml:space="preserve">[   </w:t>
-            </w:r>
-            <w:proofErr w:type="gramStart"/>
-            <w:r>
-              <w:t xml:space="preserve">  ]</w:t>
-            </w:r>
-            <w:proofErr w:type="gramEnd"/>
-            <w:r>
-              <w:t xml:space="preserve">  </w:t>
+              <w:t>[</w:t>
+            </w:r>
+            <w:r>
+              <w:t>${</w:t>
+            </w:r>
+            <w:proofErr w:type="spellStart"/>
+            <w:r>
+              <w:t>lamp_do_eo</w:t>
+            </w:r>
+            <w:proofErr w:type="spellEnd"/>
+            <w:r>
+              <w:t>}</w:t>
+            </w:r>
+            <w:r>
+              <w:t xml:space="preserve">]  </w:t>
             </w:r>
             <w:proofErr w:type="spellStart"/>
             <w:r>
@@ -2241,15 +2521,21 @@
               <w:ind w:left="0" w:hanging="2"/>
             </w:pPr>
             <w:r>
-              <w:t xml:space="preserve">[   </w:t>
-            </w:r>
-            <w:proofErr w:type="gramStart"/>
-            <w:r>
-              <w:t xml:space="preserve">  ]</w:t>
-            </w:r>
-            <w:proofErr w:type="gramEnd"/>
-            <w:r>
-              <w:t xml:space="preserve">  </w:t>
+              <w:t>[</w:t>
+            </w:r>
+            <w:r>
+              <w:t>${</w:t>
+            </w:r>
+            <w:proofErr w:type="spellStart"/>
+            <w:r>
+              <w:t>lamp_dok_prioritas</w:t>
+            </w:r>
+            <w:proofErr w:type="spellEnd"/>
+            <w:r>
+              <w:t>}</w:t>
+            </w:r>
+            <w:r>
+              <w:t xml:space="preserve">]  </w:t>
             </w:r>
             <w:proofErr w:type="spellStart"/>
             <w:r>
@@ -2278,15 +2564,21 @@
               <w:ind w:left="0" w:hanging="2"/>
             </w:pPr>
             <w:r>
-              <w:t xml:space="preserve">[   </w:t>
-            </w:r>
-            <w:proofErr w:type="gramStart"/>
-            <w:r>
-              <w:t xml:space="preserve">  ]</w:t>
-            </w:r>
-            <w:proofErr w:type="gramEnd"/>
-            <w:r>
-              <w:t xml:space="preserve">  </w:t>
+              <w:t>[</w:t>
+            </w:r>
+            <w:r>
+              <w:t>${</w:t>
+            </w:r>
+            <w:proofErr w:type="spellStart"/>
+            <w:r>
+              <w:t>lamp_dok_pct</w:t>
+            </w:r>
+            <w:proofErr w:type="spellEnd"/>
+            <w:r>
+              <w:t>}</w:t>
+            </w:r>
+            <w:r>
+              <w:t xml:space="preserve">]  </w:t>
             </w:r>
             <w:proofErr w:type="spellStart"/>
             <w:r>
@@ -2318,15 +2610,24 @@
               <w:ind w:left="0" w:hanging="2"/>
             </w:pPr>
             <w:r>
-              <w:t xml:space="preserve">[   </w:t>
-            </w:r>
-            <w:proofErr w:type="gramStart"/>
-            <w:r>
-              <w:t xml:space="preserve">  ]</w:t>
-            </w:r>
-            <w:proofErr w:type="gramEnd"/>
-            <w:r>
-              <w:t xml:space="preserve">  </w:t>
+              <w:t>[</w:t>
+            </w:r>
+            <w:r>
+              <w:t>${</w:t>
+            </w:r>
+            <w:proofErr w:type="spellStart"/>
+            <w:r>
+              <w:t>lamp</w:t>
+            </w:r>
+            <w:r>
+              <w:t>_jasad_renik</w:t>
+            </w:r>
+            <w:proofErr w:type="spellEnd"/>
+            <w:r>
+              <w:t>}</w:t>
+            </w:r>
+            <w:r>
+              <w:t xml:space="preserve">]  </w:t>
             </w:r>
             <w:proofErr w:type="spellStart"/>
             <w:r>
@@ -2371,15 +2672,7 @@
               <w:ind w:left="0" w:hanging="2"/>
             </w:pPr>
             <w:r>
-              <w:t xml:space="preserve">[ </w:t>
-            </w:r>
-            <w:proofErr w:type="gramStart"/>
-            <w:r>
-              <w:t>X ]</w:t>
-            </w:r>
-            <w:proofErr w:type="gramEnd"/>
-            <w:r>
-              <w:t xml:space="preserve">  </w:t>
+              <w:t xml:space="preserve">[ X ]  </w:t>
             </w:r>
             <w:proofErr w:type="spellStart"/>
             <w:r>
@@ -2390,95 +2683,106 @@
               <w:t xml:space="preserve"> lain (</w:t>
             </w:r>
             <w:proofErr w:type="spellStart"/>
-            <w:proofErr w:type="gramStart"/>
             <w:r>
               <w:t>sebutkan</w:t>
             </w:r>
             <w:proofErr w:type="spellEnd"/>
             <w:r>
-              <w:t>)  :</w:t>
-            </w:r>
-            <w:proofErr w:type="gramEnd"/>
+              <w:t xml:space="preserve">)  : </w:t>
+            </w:r>
+          </w:p>
+          <w:p>
+            <w:pPr>
+              <w:ind w:left="0" w:hanging="2"/>
+            </w:pPr>
+            <w:r>
+              <w:t xml:space="preserve">          1. </w:t>
+            </w:r>
+            <w:proofErr w:type="spellStart"/>
+            <w:r>
+              <w:t>Fotocopy</w:t>
+            </w:r>
+            <w:proofErr w:type="spellEnd"/>
+            <w:r>
+              <w:t xml:space="preserve"> KTP </w:t>
+            </w:r>
+            <w:proofErr w:type="spellStart"/>
+            <w:r>
+              <w:t>Pemohon</w:t>
+            </w:r>
+            <w:proofErr w:type="spellEnd"/>
+          </w:p>
+          <w:p>
+            <w:pPr>
+              <w:ind w:left="0" w:hanging="2"/>
+            </w:pPr>
+            <w:r>
+              <w:t xml:space="preserve">          2. </w:t>
+            </w:r>
+            <w:proofErr w:type="spellStart"/>
+            <w:r>
+              <w:t>Fotocopy</w:t>
+            </w:r>
+            <w:proofErr w:type="spellEnd"/>
+            <w:r>
+              <w:t xml:space="preserve"> KTP Para Inventor</w:t>
+            </w:r>
+          </w:p>
+          <w:p>
+            <w:pPr>
+              <w:ind w:left="0" w:hanging="2"/>
+            </w:pPr>
+            <w:r>
+              <w:t xml:space="preserve">          3. </w:t>
+            </w:r>
+            <w:proofErr w:type="spellStart"/>
+            <w:r>
+              <w:t>Deskripsi</w:t>
+            </w:r>
+            <w:proofErr w:type="spellEnd"/>
+            <w:r>
+              <w:t xml:space="preserve"> Bahasa Indonesia</w:t>
+            </w:r>
+          </w:p>
+          <w:p>
+            <w:pPr>
+              <w:ind w:left="0" w:hanging="2"/>
+            </w:pPr>
+          </w:p>
+          <w:p>
+            <w:pPr>
+              <w:ind w:left="0" w:hanging="2"/>
+            </w:pPr>
+            <w:r>
+              <w:t>Dan 3 (</w:t>
+            </w:r>
+            <w:proofErr w:type="spellStart"/>
+            <w:r>
+              <w:t>tiga</w:t>
+            </w:r>
+            <w:proofErr w:type="spellEnd"/>
+            <w:r>
+              <w:t xml:space="preserve">) </w:t>
+            </w:r>
+            <w:proofErr w:type="spellStart"/>
+            <w:r>
+              <w:t>rangkap</w:t>
+            </w:r>
+            <w:proofErr w:type="spellEnd"/>
             <w:r>
               <w:t xml:space="preserve"> </w:t>
             </w:r>
-          </w:p>
-          <w:p>
-            <w:pPr>
-              <w:ind w:left="0" w:hanging="2"/>
-            </w:pPr>
-            <w:r>
-              <w:t xml:space="preserve">          1. </w:t>
-            </w:r>
-            <w:proofErr w:type="spellStart"/>
-            <w:r>
-              <w:t>Fotocopy</w:t>
-            </w:r>
-            <w:proofErr w:type="spellEnd"/>
-            <w:r>
-              <w:t xml:space="preserve"> KTP </w:t>
-            </w:r>
-            <w:proofErr w:type="spellStart"/>
-            <w:r>
-              <w:t>Pemohon</w:t>
-            </w:r>
-            <w:proofErr w:type="spellEnd"/>
-          </w:p>
-          <w:p>
-            <w:pPr>
-              <w:ind w:left="0" w:hanging="2"/>
-            </w:pPr>
-            <w:r>
-              <w:t xml:space="preserve">          2. </w:t>
-            </w:r>
-            <w:proofErr w:type="spellStart"/>
-            <w:r>
-              <w:t>Fotocopy</w:t>
-            </w:r>
-            <w:proofErr w:type="spellEnd"/>
-            <w:r>
-              <w:t xml:space="preserve"> KTP Para Inventor</w:t>
-            </w:r>
-          </w:p>
-          <w:p>
-            <w:pPr>
-              <w:ind w:left="0" w:hanging="2"/>
-            </w:pPr>
-            <w:r>
-              <w:t xml:space="preserve">          3. </w:t>
-            </w:r>
-            <w:proofErr w:type="spellStart"/>
-            <w:r>
-              <w:t>Deskripsi</w:t>
-            </w:r>
-            <w:proofErr w:type="spellEnd"/>
-            <w:r>
-              <w:t xml:space="preserve"> Bahasa Indonesia</w:t>
-            </w:r>
-          </w:p>
-          <w:p>
-            <w:pPr>
-              <w:ind w:left="0" w:hanging="2"/>
-            </w:pPr>
-          </w:p>
-          <w:p>
-            <w:pPr>
-              <w:ind w:left="0" w:hanging="2"/>
-            </w:pPr>
-            <w:r>
-              <w:t>Dan 3 (</w:t>
-            </w:r>
-            <w:proofErr w:type="spellStart"/>
-            <w:r>
-              <w:t>tiga</w:t>
-            </w:r>
-            <w:proofErr w:type="spellEnd"/>
-            <w:r>
-              <w:t xml:space="preserve">) </w:t>
-            </w:r>
-            <w:proofErr w:type="spellStart"/>
-            <w:r>
-              <w:t>rangkap</w:t>
+            <w:proofErr w:type="spellStart"/>
+            <w:r>
+              <w:t>invensi</w:t>
+            </w:r>
+            <w:proofErr w:type="spellEnd"/>
+            <w:r>
+              <w:t xml:space="preserve"> yang </w:t>
+            </w:r>
+            <w:proofErr w:type="spellStart"/>
+            <w:r>
+              <w:t>terdiri</w:t>
             </w:r>
             <w:proofErr w:type="spellEnd"/>
             <w:r>
@@ -2486,90 +2790,75 @@
             </w:r>
             <w:proofErr w:type="spellStart"/>
             <w:r>
-              <w:t>invensi</w:t>
-            </w:r>
-            <w:proofErr w:type="spellEnd"/>
-            <w:r>
-              <w:t xml:space="preserve"> yang </w:t>
-            </w:r>
-            <w:proofErr w:type="spellStart"/>
-            <w:r>
-              <w:t>terdiri</w:t>
+              <w:t>dari</w:t>
+            </w:r>
+            <w:proofErr w:type="spellEnd"/>
+            <w:r>
+              <w:t xml:space="preserve"> :</w:t>
+            </w:r>
+          </w:p>
+          <w:p>
+            <w:pPr>
+              <w:ind w:left="0" w:hanging="2"/>
+            </w:pPr>
+            <w:r>
+              <w:t xml:space="preserve">Hah </w:t>
+            </w:r>
+            <w:proofErr w:type="spellStart"/>
+            <w:r>
+              <w:t>mkst</w:t>
+            </w:r>
+            <w:proofErr w:type="spellEnd"/>
+          </w:p>
+          <w:p>
+            <w:pPr>
+              <w:ind w:left="0" w:hanging="2"/>
+              <w:rPr>
+                <w:lang w:val="en-ID"/>
+              </w:rPr>
+            </w:pPr>
+            <w:r>
+              <w:t xml:space="preserve">[ X ]  </w:t>
+            </w:r>
+            <w:proofErr w:type="spellStart"/>
+            <w:r>
+              <w:t>uraian</w:t>
             </w:r>
             <w:proofErr w:type="spellEnd"/>
             <w:r>
               <w:t xml:space="preserve"> </w:t>
             </w:r>
-            <w:proofErr w:type="spellStart"/>
-            <w:proofErr w:type="gramStart"/>
-            <w:r>
-              <w:t>dari</w:t>
-            </w:r>
-            <w:proofErr w:type="spellEnd"/>
-            <w:r>
-              <w:t xml:space="preserve"> :</w:t>
-            </w:r>
-            <w:proofErr w:type="gramEnd"/>
-          </w:p>
-          <w:p>
-            <w:pPr>
-              <w:ind w:left="0" w:hanging="2"/>
-            </w:pPr>
-          </w:p>
-          <w:p>
-            <w:pPr>
-              <w:ind w:left="0" w:hanging="2"/>
-              <w:rPr>
-                <w:color w:val="FF0000"/>
-              </w:rPr>
-            </w:pPr>
-            <w:r>
-              <w:rPr>
-                <w:color w:val="FF0000"/>
-              </w:rPr>
-              <w:t xml:space="preserve">[ </w:t>
-            </w:r>
-            <w:proofErr w:type="gramStart"/>
-            <w:r>
-              <w:rPr>
-                <w:color w:val="FF0000"/>
-              </w:rPr>
-              <w:t>X ]</w:t>
-            </w:r>
-            <w:proofErr w:type="gramEnd"/>
-            <w:r>
-              <w:rPr>
-                <w:color w:val="FF0000"/>
-              </w:rPr>
-              <w:t xml:space="preserve">  </w:t>
-            </w:r>
-            <w:proofErr w:type="spellStart"/>
-            <w:proofErr w:type="gramStart"/>
-            <w:r>
-              <w:rPr>
-                <w:color w:val="FF0000"/>
-              </w:rPr>
-              <w:t>uraian</w:t>
-            </w:r>
-            <w:proofErr w:type="spellEnd"/>
-            <w:r>
-              <w:rPr>
-                <w:color w:val="FF0000"/>
-              </w:rPr>
-              <w:t xml:space="preserve">  .........</w:t>
-            </w:r>
-            <w:proofErr w:type="gramEnd"/>
-            <w:r>
-              <w:rPr>
-                <w:color w:val="FF0000"/>
-              </w:rPr>
-              <w:t xml:space="preserve"> ............ </w:t>
-            </w:r>
-            <w:proofErr w:type="spellStart"/>
-            <w:r>
-              <w:rPr>
-                <w:color w:val="FF0000"/>
-              </w:rPr>
+            <w:r>
+              <w:t>${</w:t>
+            </w:r>
+            <w:proofErr w:type="spellStart"/>
+            <w:r>
+              <w:rPr>
+                <w:lang w:val="en-ID"/>
+              </w:rPr>
+              <w:t>uraian_halaman</w:t>
+            </w:r>
+            <w:proofErr w:type="spellEnd"/>
+            <w:r>
+              <w:rPr>
+                <w:lang w:val="en-ID"/>
+              </w:rPr>
+              <w:t>}</w:t>
+            </w:r>
+            <w:r>
+              <w:rPr>
+                <w:lang w:val="en-ID"/>
+              </w:rPr>
+              <w:t xml:space="preserve"> </w:t>
+            </w:r>
+            <w:r>
+              <w:rPr>
+                <w:lang w:val="en-ID"/>
+              </w:rPr>
+              <w:t xml:space="preserve"> </w:t>
+            </w:r>
+            <w:proofErr w:type="spellStart"/>
+            <w:r>
               <w:t>halaman</w:t>
             </w:r>
             <w:proofErr w:type="spellEnd"/>
@@ -2578,56 +2867,36 @@
             <w:pPr>
               <w:ind w:left="0" w:hanging="2"/>
               <w:rPr>
-                <w:color w:val="FF0000"/>
-              </w:rPr>
-            </w:pPr>
-            <w:r>
-              <w:rPr>
-                <w:color w:val="FF0000"/>
-              </w:rPr>
-              <w:t xml:space="preserve">[ </w:t>
-            </w:r>
-            <w:proofErr w:type="gramStart"/>
-            <w:r>
-              <w:rPr>
-                <w:color w:val="FF0000"/>
-              </w:rPr>
-              <w:t>X ]</w:t>
-            </w:r>
-            <w:proofErr w:type="gramEnd"/>
-            <w:r>
-              <w:rPr>
-                <w:color w:val="FF0000"/>
-              </w:rPr>
-              <w:t xml:space="preserve">  </w:t>
-            </w:r>
-            <w:proofErr w:type="spellStart"/>
-            <w:proofErr w:type="gramStart"/>
-            <w:r>
-              <w:rPr>
-                <w:color w:val="FF0000"/>
-              </w:rPr>
+                <w:lang w:val="en-ID"/>
+              </w:rPr>
+            </w:pPr>
+            <w:r>
+              <w:t xml:space="preserve">[ X ]  </w:t>
+            </w:r>
+            <w:proofErr w:type="spellStart"/>
+            <w:r>
               <w:t>klaim</w:t>
             </w:r>
             <w:proofErr w:type="spellEnd"/>
             <w:r>
-              <w:rPr>
-                <w:color w:val="FF0000"/>
-              </w:rPr>
-              <w:t xml:space="preserve">  ..........</w:t>
-            </w:r>
-            <w:proofErr w:type="gramEnd"/>
-            <w:r>
-              <w:rPr>
-                <w:color w:val="FF0000"/>
-              </w:rPr>
-              <w:t xml:space="preserve">  ........... </w:t>
-            </w:r>
-            <w:proofErr w:type="spellStart"/>
-            <w:r>
-              <w:rPr>
-                <w:color w:val="FF0000"/>
-              </w:rPr>
+              <w:t xml:space="preserve"> ${</w:t>
+            </w:r>
+            <w:proofErr w:type="spellStart"/>
+            <w:r>
+              <w:rPr>
+                <w:lang w:val="en-ID"/>
+              </w:rPr>
+              <w:t>klaim_buah</w:t>
+            </w:r>
+            <w:proofErr w:type="spellEnd"/>
+            <w:r>
+              <w:rPr>
+                <w:lang w:val="en-ID"/>
+              </w:rPr>
+              <w:t xml:space="preserve">} </w:t>
+            </w:r>
+            <w:proofErr w:type="spellStart"/>
+            <w:r>
               <w:t>buah</w:t>
             </w:r>
             <w:proofErr w:type="spellEnd"/>
@@ -2636,56 +2905,39 @@
             <w:pPr>
               <w:ind w:left="0" w:hanging="2"/>
               <w:rPr>
-                <w:color w:val="FF0000"/>
-              </w:rPr>
-            </w:pPr>
-            <w:r>
-              <w:rPr>
-                <w:color w:val="FF0000"/>
-              </w:rPr>
-              <w:t xml:space="preserve">[ </w:t>
-            </w:r>
-            <w:proofErr w:type="gramStart"/>
-            <w:r>
-              <w:rPr>
-                <w:color w:val="FF0000"/>
-              </w:rPr>
-              <w:t>X ]</w:t>
-            </w:r>
-            <w:proofErr w:type="gramEnd"/>
-            <w:r>
-              <w:rPr>
-                <w:color w:val="FF0000"/>
-              </w:rPr>
-              <w:t xml:space="preserve">  </w:t>
-            </w:r>
-            <w:proofErr w:type="spellStart"/>
-            <w:proofErr w:type="gramStart"/>
-            <w:r>
-              <w:rPr>
-                <w:color w:val="FF0000"/>
-              </w:rPr>
+                <w:lang w:val="en-ID"/>
+              </w:rPr>
+            </w:pPr>
+            <w:r>
+              <w:t xml:space="preserve">[ X ]  </w:t>
+            </w:r>
+            <w:proofErr w:type="spellStart"/>
+            <w:r>
               <w:t>abstrak</w:t>
             </w:r>
             <w:proofErr w:type="spellEnd"/>
             <w:r>
-              <w:rPr>
-                <w:color w:val="FF0000"/>
-              </w:rPr>
-              <w:t xml:space="preserve">  ....................</w:t>
-            </w:r>
-            <w:proofErr w:type="gramEnd"/>
-            <w:r>
-              <w:rPr>
-                <w:color w:val="FF0000"/>
-              </w:rPr>
               <w:t xml:space="preserve"> </w:t>
             </w:r>
-            <w:proofErr w:type="spellStart"/>
-            <w:r>
-              <w:rPr>
-                <w:color w:val="FF0000"/>
-              </w:rPr>
+            <w:r>
+              <w:t>${</w:t>
+            </w:r>
+            <w:proofErr w:type="spellStart"/>
+            <w:r>
+              <w:rPr>
+                <w:lang w:val="en-ID"/>
+              </w:rPr>
+              <w:t>abstrak_buah</w:t>
+            </w:r>
+            <w:proofErr w:type="spellEnd"/>
+            <w:r>
+              <w:t xml:space="preserve">} </w:t>
+            </w:r>
+            <w:r>
+              <w:t xml:space="preserve"> </w:t>
+            </w:r>
+            <w:proofErr w:type="spellStart"/>
+            <w:r>
               <w:t>buah</w:t>
             </w:r>
             <w:proofErr w:type="spellEnd"/>
@@ -2694,56 +2946,36 @@
             <w:pPr>
               <w:ind w:left="0" w:hanging="2"/>
               <w:rPr>
-                <w:color w:val="FF0000"/>
-              </w:rPr>
-            </w:pPr>
-            <w:r>
-              <w:rPr>
-                <w:color w:val="FF0000"/>
-              </w:rPr>
-              <w:t xml:space="preserve">[ </w:t>
-            </w:r>
-            <w:proofErr w:type="gramStart"/>
-            <w:r>
-              <w:rPr>
-                <w:color w:val="FF0000"/>
-              </w:rPr>
-              <w:t>X ]</w:t>
-            </w:r>
-            <w:proofErr w:type="gramEnd"/>
-            <w:r>
-              <w:rPr>
-                <w:color w:val="FF0000"/>
-              </w:rPr>
-              <w:t xml:space="preserve">  </w:t>
-            </w:r>
-            <w:proofErr w:type="spellStart"/>
-            <w:proofErr w:type="gramStart"/>
-            <w:r>
-              <w:rPr>
-                <w:color w:val="FF0000"/>
-              </w:rPr>
+                <w:lang w:val="en-ID"/>
+              </w:rPr>
+            </w:pPr>
+            <w:r>
+              <w:t xml:space="preserve">[ X ]  </w:t>
+            </w:r>
+            <w:proofErr w:type="spellStart"/>
+            <w:r>
               <w:t>gambar</w:t>
             </w:r>
             <w:proofErr w:type="spellEnd"/>
             <w:r>
-              <w:rPr>
-                <w:color w:val="FF0000"/>
-              </w:rPr>
-              <w:t xml:space="preserve">  ........</w:t>
-            </w:r>
-            <w:proofErr w:type="gramEnd"/>
-            <w:r>
-              <w:rPr>
-                <w:color w:val="FF0000"/>
-              </w:rPr>
-              <w:t xml:space="preserve">  .......... </w:t>
-            </w:r>
-            <w:proofErr w:type="spellStart"/>
-            <w:r>
-              <w:rPr>
-                <w:color w:val="FF0000"/>
-              </w:rPr>
+              <w:t xml:space="preserve"> ${</w:t>
+            </w:r>
+            <w:proofErr w:type="spellStart"/>
+            <w:r>
+              <w:rPr>
+                <w:lang w:val="en-ID"/>
+              </w:rPr>
+              <w:t>gambar_buah</w:t>
+            </w:r>
+            <w:proofErr w:type="spellEnd"/>
+            <w:r>
+              <w:rPr>
+                <w:lang w:val="en-ID"/>
+              </w:rPr>
+              <w:t xml:space="preserve">} </w:t>
+            </w:r>
+            <w:proofErr w:type="spellStart"/>
+            <w:r>
               <w:t>buah</w:t>
             </w:r>
             <w:proofErr w:type="spellEnd"/>
@@ -2757,6 +2989,11 @@
         <w:tc>
           <w:tcPr>
             <w:tcW w:w="1980" w:type="dxa"/>
+            <w:tcBorders>
+              <w:left w:val="single" w:sz="4" w:space="0" w:color="auto"/>
+              <w:bottom w:val="single" w:sz="4" w:space="0" w:color="auto"/>
+              <w:right w:val="single" w:sz="4" w:space="0" w:color="auto"/>
+            </w:tcBorders>
           </w:tcPr>
           <w:p>
             <w:pPr>
@@ -2866,6 +3103,12 @@
         <w:tc>
           <w:tcPr>
             <w:tcW w:w="8100" w:type="dxa"/>
+            <w:tcBorders>
+              <w:top w:val="single" w:sz="4" w:space="0" w:color="auto"/>
+              <w:left w:val="single" w:sz="4" w:space="0" w:color="auto"/>
+              <w:bottom w:val="single" w:sz="4" w:space="0" w:color="auto"/>
+              <w:right w:val="single" w:sz="4" w:space="0" w:color="auto"/>
+            </w:tcBorders>
           </w:tcPr>
           <w:p>
             <w:pPr>
@@ -2875,6 +3118,9 @@
           <w:p>
             <w:pPr>
               <w:ind w:left="0" w:hanging="2"/>
+              <w:rPr>
+                <w:lang w:val="en-ID"/>
+              </w:rPr>
             </w:pPr>
             <w:r>
               <w:t xml:space="preserve">Saya/kami </w:t>
@@ -2901,7 +3147,50 @@
             </w:r>
             <w:proofErr w:type="spellEnd"/>
             <w:r>
-              <w:t xml:space="preserve"> ....... s/d ....... </w:t>
+              <w:t xml:space="preserve"> </w:t>
+            </w:r>
+            <w:r>
+              <w:t>${</w:t>
+            </w:r>
+            <w:proofErr w:type="spellStart"/>
+            <w:r>
+              <w:rPr>
+                <w:lang w:val="en-ID"/>
+              </w:rPr>
+              <w:t>gambar_dari</w:t>
+            </w:r>
+            <w:proofErr w:type="spellEnd"/>
+            <w:r>
+              <w:rPr>
+                <w:lang w:val="en-ID"/>
+              </w:rPr>
+              <w:t>}</w:t>
+            </w:r>
+            <w:r>
+              <w:t xml:space="preserve"> s/d </w:t>
+            </w:r>
+            <w:r>
+              <w:t>${</w:t>
+            </w:r>
+            <w:proofErr w:type="spellStart"/>
+            <w:r>
+              <w:rPr>
+                <w:lang w:val="en-ID"/>
+              </w:rPr>
+              <w:t>gambar_</w:t>
+            </w:r>
+            <w:r>
+              <w:rPr>
+                <w:lang w:val="en-ID"/>
+              </w:rPr>
+              <w:t>sampai</w:t>
+            </w:r>
+            <w:proofErr w:type="spellEnd"/>
+            <w:r>
+              <w:t xml:space="preserve">} </w:t>
+            </w:r>
+            <w:r>
+              <w:t xml:space="preserve"> </w:t>
             </w:r>
             <w:proofErr w:type="spellStart"/>
             <w:r>
@@ -2989,6 +3278,12 @@
         <w:tc>
           <w:tcPr>
             <w:tcW w:w="1980" w:type="dxa"/>
+            <w:tcBorders>
+              <w:top w:val="single" w:sz="4" w:space="0" w:color="auto"/>
+              <w:left w:val="single" w:sz="4" w:space="0" w:color="auto"/>
+              <w:bottom w:val="single" w:sz="4" w:space="0" w:color="auto"/>
+              <w:right w:val="single" w:sz="4" w:space="0" w:color="auto"/>
+            </w:tcBorders>
           </w:tcPr>
           <w:p>
             <w:pPr>
@@ -3085,6 +3380,7 @@
       </w:pPr>
       <w:proofErr w:type="spellStart"/>
       <w:r>
+        <w:lastRenderedPageBreak/>
         <w:t>Untuk</w:t>
       </w:r>
       <w:proofErr w:type="spellEnd"/>
@@ -3227,7 +3523,25 @@
           <w:sz w:val="22"/>
           <w:szCs w:val="22"/>
         </w:rPr>
-        <w:t xml:space="preserve">Prof. Dr. Suharnomo, S.E., </w:t>
+        <w:t xml:space="preserve">Prof. Dr. </w:t>
+      </w:r>
+      <w:proofErr w:type="spellStart"/>
+      <w:r>
+        <w:rPr>
+          <w:color w:val="000000"/>
+          <w:sz w:val="22"/>
+          <w:szCs w:val="22"/>
+        </w:rPr>
+        <w:t>Suharnomo</w:t>
+      </w:r>
+      <w:proofErr w:type="spellEnd"/>
+      <w:r>
+        <w:rPr>
+          <w:color w:val="000000"/>
+          <w:sz w:val="22"/>
+          <w:szCs w:val="22"/>
+        </w:rPr>
+        <w:t xml:space="preserve">, S.E., </w:t>
       </w:r>
       <w:proofErr w:type="spellStart"/>
       <w:r>
@@ -3369,7 +3683,6 @@
         </w:rPr>
       </w:pPr>
       <w:proofErr w:type="spellStart"/>
-      <w:proofErr w:type="gramStart"/>
       <w:r>
         <w:rPr>
           <w:b/>
@@ -3385,7 +3698,6 @@
         </w:rPr>
         <w:t xml:space="preserve"> :</w:t>
       </w:r>
-      <w:proofErr w:type="gramEnd"/>
     </w:p>
     <w:p>
       <w:pPr>
@@ -3824,13 +4136,8 @@
       </w:r>
       <w:proofErr w:type="spellEnd"/>
       <w:r>
-        <w:t xml:space="preserve"> </w:t>
-      </w:r>
-      <w:proofErr w:type="gramStart"/>
-      <w:r>
-        <w:t>oleh :</w:t>
-      </w:r>
-      <w:proofErr w:type="gramEnd"/>
+        <w:t xml:space="preserve"> oleh :</w:t>
+      </w:r>
     </w:p>
     <w:p>
       <w:pPr>
@@ -5410,28 +5717,28 @@
 </file>
 
 <file path=customXml/item1.xml><?xml version="1.0" encoding="utf-8"?>
+<b:Sources xmlns:b="http://schemas.openxmlformats.org/officeDocument/2006/bibliography" xmlns="http://schemas.openxmlformats.org/officeDocument/2006/bibliography" SelectedStyle="\APASixthEditionOfficeOnline.xsl" StyleName="APA" Version="6"/>
+</file>
+
+<file path=customXml/item2.xml><?xml version="1.0" encoding="utf-8"?>
 <go:gDocsCustomXmlDataStorage xmlns:go="http://customooxmlschemas.google.com/" xmlns:r="http://schemas.openxmlformats.org/officeDocument/2006/relationships" uri="GoogleDocsCustomDataVersion2">
   <go:docsCustomData xmlns:go="http://customooxmlschemas.google.com/" roundtripDataSignature="AMtx7mginN8w1aeRfdtdlgpsBqSY/YTV5A==">CgMxLjA4AHIhMWVZVjhVSXM4QUZiY1FBZGExMVI3WE1JSlVrZG9PRENo</go:docsCustomData>
 </go:gDocsCustomXmlDataStorage>
 </file>
 
-<file path=customXml/item2.xml><?xml version="1.0" encoding="utf-8"?>
-<b:Sources xmlns:b="http://schemas.openxmlformats.org/officeDocument/2006/bibliography" xmlns="http://schemas.openxmlformats.org/officeDocument/2006/bibliography" SelectedStyle="\APASixthEditionOfficeOnline.xsl" StyleName="APA" Version="6"/>
+<file path=customXml/itemProps1.xml><?xml version="1.0" encoding="utf-8"?>
+<ds:datastoreItem xmlns:ds="http://schemas.openxmlformats.org/officeDocument/2006/customXml" ds:itemID="{95B6ECE9-B207-4177-89A1-FB149CD7BCAC}">
+  <ds:schemaRefs>
+    <ds:schemaRef ds:uri="http://schemas.openxmlformats.org/officeDocument/2006/bibliography"/>
+  </ds:schemaRefs>
+</ds:datastoreItem>
 </file>
 
-<file path=customXml/itemProps1.xml><?xml version="1.0" encoding="utf-8"?>
+<file path=customXml/itemProps2.xml><?xml version="1.0" encoding="utf-8"?>
 <ds:datastoreItem xmlns:ds="http://schemas.openxmlformats.org/officeDocument/2006/customXml" ds:itemID="{11111111-1234-1234-1234-123412341234}">
   <ds:schemaRefs>
     <ds:schemaRef ds:uri="http://customooxmlschemas.google.com/"/>
     <ds:schemaRef ds:uri="http://schemas.openxmlformats.org/officeDocument/2006/relationships"/>
   </ds:schemaRefs>
 </ds:datastoreItem>
-</file>
-
-<file path=customXml/itemProps2.xml><?xml version="1.0" encoding="utf-8"?>
-<ds:datastoreItem xmlns:ds="http://schemas.openxmlformats.org/officeDocument/2006/customXml" ds:itemID="{95B6ECE9-B207-4177-89A1-FB149CD7BCAC}">
-  <ds:schemaRefs>
-    <ds:schemaRef ds:uri="http://schemas.openxmlformats.org/officeDocument/2006/bibliography"/>
-  </ds:schemaRefs>
-</ds:datastoreItem>
 </file>
</xml_diff>

<commit_message>
nambahin pdf di paten
</commit_message>
<xml_diff>
--- a/public/templates/Form Daftar Paten (2025).docx
+++ b/public/templates/Form Daftar Paten (2025).docx
@@ -79,6 +79,9 @@
         <w:ind w:left="0" w:hanging="2"/>
       </w:pPr>
       <w:r>
+        <w:rPr>
+          <w:noProof/>
+        </w:rPr>
         <mc:AlternateContent>
           <mc:Choice Requires="wps">
             <w:drawing>
@@ -1251,6 +1254,26 @@
         <w:ind w:left="0" w:hanging="2"/>
       </w:pPr>
     </w:p>
+    <w:p>
+      <w:pPr>
+        <w:ind w:left="0" w:hanging="2"/>
+      </w:pPr>
+    </w:p>
+    <w:p>
+      <w:pPr>
+        <w:ind w:left="0" w:hanging="2"/>
+      </w:pPr>
+    </w:p>
+    <w:p>
+      <w:pPr>
+        <w:ind w:left="0" w:hanging="2"/>
+      </w:pPr>
+    </w:p>
+    <w:p>
+      <w:pPr>
+        <w:ind w:left="0" w:hanging="2"/>
+      </w:pPr>
+    </w:p>
     <w:tbl>
       <w:tblPr>
         <w:tblStyle w:val="a1"/>
@@ -1715,6 +1738,7 @@
             <w:tcBorders>
               <w:top w:val="single" w:sz="4" w:space="0" w:color="auto"/>
               <w:left w:val="single" w:sz="4" w:space="0" w:color="auto"/>
+              <w:bottom w:val="single" w:sz="4" w:space="0" w:color="auto"/>
               <w:right w:val="single" w:sz="4" w:space="0" w:color="auto"/>
             </w:tcBorders>
           </w:tcPr>
@@ -2519,6 +2543,7 @@
           <w:tcPr>
             <w:tcW w:w="1980" w:type="dxa"/>
             <w:tcBorders>
+              <w:top w:val="single" w:sz="4" w:space="0" w:color="auto"/>
               <w:left w:val="single" w:sz="4" w:space="0" w:color="auto"/>
               <w:bottom w:val="single" w:sz="4" w:space="0" w:color="auto"/>
               <w:right w:val="single" w:sz="4" w:space="0" w:color="auto"/>
@@ -2720,13 +2745,8 @@
             <w:pPr>
               <w:ind w:left="0" w:hanging="2"/>
             </w:pPr>
-            <w:proofErr w:type="spellStart"/>
-            <w:r>
-              <w:t>Menyertai</w:t>
-            </w:r>
-            <w:proofErr w:type="spellEnd"/>
-            <w:r>
-              <w:t xml:space="preserve"> </w:t>
+            <w:r>
+              <w:t xml:space="preserve">Menyertai </w:t>
             </w:r>
             <w:proofErr w:type="spellStart"/>
             <w:r>
@@ -2831,72 +2851,52 @@
     </w:p>
     <w:p>
       <w:pPr>
-        <w:ind w:left="0" w:hanging="2"/>
-      </w:pPr>
-    </w:p>
-    <w:p>
-      <w:pPr>
-        <w:ind w:left="0" w:hanging="2"/>
-      </w:pPr>
-    </w:p>
-    <w:p>
-      <w:pPr>
-        <w:ind w:left="0" w:hanging="2"/>
-      </w:pPr>
-    </w:p>
-    <w:p>
-      <w:pPr>
-        <w:ind w:left="0" w:hanging="2"/>
-      </w:pPr>
-    </w:p>
-    <w:p>
-      <w:pPr>
-        <w:ind w:left="0" w:hanging="2"/>
-      </w:pPr>
-    </w:p>
-    <w:p>
-      <w:pPr>
-        <w:ind w:left="0" w:hanging="2"/>
-      </w:pPr>
-    </w:p>
-    <w:p>
-      <w:pPr>
-        <w:ind w:left="0" w:hanging="2"/>
-      </w:pPr>
-    </w:p>
-    <w:p>
-      <w:pPr>
-        <w:ind w:left="0" w:hanging="2"/>
-      </w:pPr>
-    </w:p>
-    <w:p>
-      <w:pPr>
-        <w:ind w:left="0" w:hanging="2"/>
-      </w:pPr>
-    </w:p>
-    <w:p>
-      <w:pPr>
-        <w:ind w:left="0" w:hanging="2"/>
-      </w:pPr>
-    </w:p>
-    <w:p>
-      <w:pPr>
-        <w:ind w:left="0" w:hanging="2"/>
-      </w:pPr>
-    </w:p>
-    <w:p>
-      <w:pPr>
-        <w:ind w:left="0" w:hanging="2"/>
-      </w:pPr>
-    </w:p>
-    <w:p>
-      <w:pPr>
-        <w:ind w:left="0" w:hanging="2"/>
-      </w:pPr>
-    </w:p>
-    <w:p>
-      <w:pPr>
-        <w:ind w:left="0" w:hanging="2"/>
+        <w:ind w:leftChars="0" w:left="0" w:firstLineChars="0" w:firstLine="0"/>
+      </w:pPr>
+    </w:p>
+    <w:p>
+      <w:pPr>
+        <w:ind w:leftChars="0" w:left="0" w:firstLineChars="0" w:firstLine="0"/>
+      </w:pPr>
+    </w:p>
+    <w:p>
+      <w:pPr>
+        <w:ind w:leftChars="0" w:left="0" w:firstLineChars="0" w:firstLine="0"/>
+      </w:pPr>
+    </w:p>
+    <w:p>
+      <w:pPr>
+        <w:ind w:leftChars="0" w:left="0" w:firstLineChars="0" w:firstLine="0"/>
+      </w:pPr>
+    </w:p>
+    <w:p>
+      <w:pPr>
+        <w:ind w:leftChars="0" w:left="0" w:firstLineChars="0" w:firstLine="0"/>
+      </w:pPr>
+    </w:p>
+    <w:p>
+      <w:pPr>
+        <w:ind w:leftChars="0" w:left="0" w:firstLineChars="0" w:firstLine="0"/>
+      </w:pPr>
+    </w:p>
+    <w:p>
+      <w:pPr>
+        <w:ind w:leftChars="0" w:left="0" w:firstLineChars="0" w:firstLine="0"/>
+      </w:pPr>
+    </w:p>
+    <w:p>
+      <w:pPr>
+        <w:ind w:leftChars="0" w:left="0" w:firstLineChars="0" w:firstLine="0"/>
+      </w:pPr>
+    </w:p>
+    <w:p>
+      <w:pPr>
+        <w:ind w:leftChars="0" w:left="0" w:firstLineChars="0" w:firstLine="0"/>
+      </w:pPr>
+    </w:p>
+    <w:p>
+      <w:pPr>
+        <w:ind w:leftChars="0" w:left="0" w:firstLineChars="0" w:firstLine="0"/>
       </w:pPr>
       <w:proofErr w:type="spellStart"/>
       <w:r>
@@ -3115,6 +3115,9 @@
         <w:ind w:left="0" w:hanging="2"/>
       </w:pPr>
       <w:r>
+        <w:rPr>
+          <w:noProof/>
+        </w:rPr>
         <mc:AlternateContent>
           <mc:Choice Requires="wps">
             <w:drawing>
@@ -3161,7 +3164,7 @@
               </wp:anchor>
             </w:drawing>
           </mc:Choice>
-          <mc:Fallback xmlns:sl="http://schemas.openxmlformats.org/schemaLibrary/2006/main" xmlns:a="http://schemas.openxmlformats.org/drawingml/2006/main" xmlns:pic="http://schemas.openxmlformats.org/drawingml/2006/picture" xmlns:c="http://schemas.openxmlformats.org/drawingml/2006/chart" xmlns:lc="http://schemas.openxmlformats.org/drawingml/2006/lockedCanvas" xmlns:dgm="http://schemas.openxmlformats.org/drawingml/2006/diagram" xmlns="http://schemas.microsoft.com/office/tasks/2019/documenttasks" xmlns:cr="http://schemas.microsoft.com/office/comments/2020/reactions">
+          <mc:Fallback xmlns:cr="http://schemas.microsoft.com/office/comments/2020/reactions" xmlns="http://schemas.microsoft.com/office/tasks/2019/documenttasks" xmlns:dgm="http://schemas.openxmlformats.org/drawingml/2006/diagram" xmlns:lc="http://schemas.openxmlformats.org/drawingml/2006/lockedCanvas" xmlns:c="http://schemas.openxmlformats.org/drawingml/2006/chart" xmlns:pic="http://schemas.openxmlformats.org/drawingml/2006/picture" xmlns:a="http://schemas.openxmlformats.org/drawingml/2006/main" xmlns:sl="http://schemas.openxmlformats.org/schemaLibrary/2006/main">
             <w:drawing>
               <wp:anchor allowOverlap="1" behindDoc="0" distB="0" distT="0" distL="114300" distR="114300" hidden="0" layoutInCell="1" locked="0" relativeHeight="0" simplePos="0">
                 <wp:simplePos x="0" y="0"/>
@@ -5199,28 +5202,28 @@
 </file>
 
 <file path=customXml/item1.xml><?xml version="1.0" encoding="utf-8"?>
+<b:Sources xmlns:b="http://schemas.openxmlformats.org/officeDocument/2006/bibliography" xmlns="http://schemas.openxmlformats.org/officeDocument/2006/bibliography" SelectedStyle="\APASixthEditionOfficeOnline.xsl" StyleName="APA" Version="6"/>
+</file>
+
+<file path=customXml/item2.xml><?xml version="1.0" encoding="utf-8"?>
 <go:gDocsCustomXmlDataStorage xmlns:go="http://customooxmlschemas.google.com/" xmlns:r="http://schemas.openxmlformats.org/officeDocument/2006/relationships" uri="GoogleDocsCustomDataVersion2">
   <go:docsCustomData xmlns:go="http://customooxmlschemas.google.com/" roundtripDataSignature="AMtx7mginN8w1aeRfdtdlgpsBqSY/YTV5A==">CgMxLjA4AHIhMWVZVjhVSXM4QUZiY1FBZGExMVI3WE1JSlVrZG9PRENo</go:docsCustomData>
 </go:gDocsCustomXmlDataStorage>
 </file>
 
-<file path=customXml/item2.xml><?xml version="1.0" encoding="utf-8"?>
-<b:Sources xmlns:b="http://schemas.openxmlformats.org/officeDocument/2006/bibliography" xmlns="http://schemas.openxmlformats.org/officeDocument/2006/bibliography" SelectedStyle="\APASixthEditionOfficeOnline.xsl" StyleName="APA" Version="6"/>
+<file path=customXml/itemProps1.xml><?xml version="1.0" encoding="utf-8"?>
+<ds:datastoreItem xmlns:ds="http://schemas.openxmlformats.org/officeDocument/2006/customXml" ds:itemID="{95B6ECE9-B207-4177-89A1-FB149CD7BCAC}">
+  <ds:schemaRefs>
+    <ds:schemaRef ds:uri="http://schemas.openxmlformats.org/officeDocument/2006/bibliography"/>
+  </ds:schemaRefs>
+</ds:datastoreItem>
 </file>
 
-<file path=customXml/itemProps1.xml><?xml version="1.0" encoding="utf-8"?>
+<file path=customXml/itemProps2.xml><?xml version="1.0" encoding="utf-8"?>
 <ds:datastoreItem xmlns:ds="http://schemas.openxmlformats.org/officeDocument/2006/customXml" ds:itemID="{11111111-1234-1234-1234-123412341234}">
   <ds:schemaRefs>
     <ds:schemaRef ds:uri="http://customooxmlschemas.google.com/"/>
     <ds:schemaRef ds:uri="http://schemas.openxmlformats.org/officeDocument/2006/relationships"/>
   </ds:schemaRefs>
 </ds:datastoreItem>
-</file>
-
-<file path=customXml/itemProps2.xml><?xml version="1.0" encoding="utf-8"?>
-<ds:datastoreItem xmlns:ds="http://schemas.openxmlformats.org/officeDocument/2006/customXml" ds:itemID="{95B6ECE9-B207-4177-89A1-FB149CD7BCAC}">
-  <ds:schemaRefs>
-    <ds:schemaRef ds:uri="http://schemas.openxmlformats.org/officeDocument/2006/bibliography"/>
-  </ds:schemaRefs>
-</ds:datastoreItem>
 </file>
</xml_diff>